<commit_message>
Scope activation CIN requirement and harden document template dates
</commit_message>
<xml_diff>
--- a/public/assets/documents/Contrat_de_formation_LionsGeek.docx
+++ b/public/assets/documents/Contrat_de_formation_LionsGeek.docx
@@ -262,7 +262,7 @@
           <w:sz w:val="20"/>
           <w:szCs w:val="20"/>
         </w:rPr>
-        <w:t xml:space="preserve">La formation débutera le </w:t>
+        <w:t xml:space="preserve">La formation débutera le {{start_date}} et se terminera le {{end_date}}.</w:t>
       </w:r>
       <w:r>
         <w:rPr>
@@ -270,21 +270,21 @@
           <w:szCs w:val="20"/>
           <w:highlight w:val="yellow"/>
         </w:rPr>
-        <w:t>03/02/2025</w:t>
-      </w:r>
-      <w:r>
-        <w:rPr>
-          <w:sz w:val="20"/>
-          <w:szCs w:val="20"/>
-        </w:rPr>
-        <w:t xml:space="preserve"> </w:t>
-      </w:r>
-      <w:r>
-        <w:rPr>
-          <w:sz w:val="20"/>
-          <w:szCs w:val="20"/>
-        </w:rPr>
-        <w:t xml:space="preserve">et se terminera le </w:t>
+        <w:t/>
+      </w:r>
+      <w:r>
+        <w:rPr>
+          <w:sz w:val="20"/>
+          <w:szCs w:val="20"/>
+        </w:rPr>
+        <w:t xml:space="preserve"/>
+      </w:r>
+      <w:r>
+        <w:rPr>
+          <w:sz w:val="20"/>
+          <w:szCs w:val="20"/>
+        </w:rPr>
+        <w:t xml:space="preserve"/>
       </w:r>
       <w:r>
         <w:rPr>
@@ -292,7 +292,7 @@
           <w:szCs w:val="20"/>
           <w:highlight w:val="yellow"/>
         </w:rPr>
-        <w:t>10/08/2025</w:t>
+        <w:t/>
       </w:r>
       <w:r>
         <w:rPr>
@@ -300,7 +300,7 @@
           <w:szCs w:val="20"/>
           <w:highlight w:val="yellow"/>
         </w:rPr>
-        <w:t>.</w:t>
+        <w:t/>
       </w:r>
     </w:p>
     <w:p>

</xml_diff>